<commit_message>
fix titles in file
</commit_message>
<xml_diff>
--- a/2026/03/docx/cs/CV_Ponomarov_Serhii_26_03.docx
+++ b/2026/03/docx/cs/CV_Ponomarov_Serhii_26_03.docx
@@ -500,7 +500,490 @@
                 <wp:inline distB="114300" distT="114300" distL="114300" distR="114300">
                   <wp:extent cx="3981450" cy="25400"/>
                   <wp:effectExtent b="0" l="0" r="0" t="0"/>
-                  <wp:docPr descr="horizontal line" id="2" name="image1.png"/>
+                  <wp:docPr descr="horizontal line" id="2" name="image2.png"/>
+                  <a:graphic>
+                    <a:graphicData uri="http://schemas.openxmlformats.org/drawingml/2006/picture">
+                      <pic:pic>
+                        <pic:nvPicPr>
+                          <pic:cNvPr descr="horizontal line" id="0" name="image2.png"/>
+                          <pic:cNvPicPr preferRelativeResize="0"/>
+                        </pic:nvPicPr>
+                        <pic:blipFill>
+                          <a:blip r:embed="rId12"/>
+                          <a:srcRect b="0" l="0" r="0" t="0"/>
+                          <a:stretch>
+                            <a:fillRect/>
+                          </a:stretch>
+                        </pic:blipFill>
+                        <pic:spPr>
+                          <a:xfrm>
+                            <a:off x="0" y="0"/>
+                            <a:ext cx="3981450" cy="25400"/>
+                          </a:xfrm>
+                          <a:prstGeom prst="rect"/>
+                          <a:ln/>
+                        </pic:spPr>
+                      </pic:pic>
+                    </a:graphicData>
+                  </a:graphic>
+                </wp:inline>
+              </w:drawing>
+            </w:r>
+            <w:r>
+              <w:rPr>
+                <w:rtl w:val="0"/>
+              </w:rPr>
+            </w:r>
+          </w:p>
+          <w:p>
+            <w:pPr>
+              <w:pStyle w:val="Heading1"/>
+              <w:keepNext w:val="0"/>
+              <w:keepLines w:val="0"/>
+              <w:widowControl w:val="0"/>
+              <w:rPr/>
+            </w:pPr>
+            <w:bookmarkStart w:colFirst="0" w:colLast="0" w:name="_wr714354mg9g" w:id="4"/>
+            <w:bookmarkEnd w:id="4"/>
+            <w:r>
+              <w:rPr>
+                <w:rtl w:val="0"/>
+              </w:rPr>
+              <w:t xml:space="preserve">Skills : </w:t>
+            </w:r>
+          </w:p>
+          <w:p>
+            <w:pPr>
+              <w:pStyle w:val="Heading1"/>
+              <w:keepNext w:val="0"/>
+              <w:keepLines w:val="0"/>
+              <w:widowControl w:val="0"/>
+              <w:rPr>
+                <w:color w:val="ffffff"/>
+                <w:sz w:val="2"/>
+                <w:szCs w:val="2"/>
+              </w:rPr>
+            </w:pPr>
+            <w:bookmarkStart w:colFirst="0" w:colLast="0" w:name="_11hus4v8bf1x" w:id="5"/>
+            <w:bookmarkEnd w:id="5"/>
+            <w:r>
+              <w:rPr>
+                <w:sz w:val="20"/>
+                <w:szCs w:val="20"/>
+                <w:rtl w:val="0"/>
+              </w:rPr>
+              <w:t xml:space="preserve">React, Vue.js, Vite, Babel, JSX, TSX, Components, CSS Modules, Sass, Responsive Design, Cross-Browser Compatibility, SVG, Canvas, JavaScript, TypeScript, Node.js, Express.js, Python, Java, REST API, WebSockets, Prisma, Mongoose, MongoDB, PostgreSQL, MySQL, SQLite, Nginx, Bash, Shell , Ubuntu, Linux, Cloudflare</w:t>
+            </w:r>
+            <w:r>
+              <w:rPr>
+                <w:color w:val="ffffff"/>
+                <w:sz w:val="20"/>
+                <w:szCs w:val="20"/>
+                <w:rtl w:val="0"/>
+              </w:rPr>
+              <w:t xml:space="preserve">,</w:t>
+            </w:r>
+            <w:r>
+              <w:rPr>
+                <w:color w:val="ffffff"/>
+                <w:sz w:val="2"/>
+                <w:szCs w:val="2"/>
+                <w:rtl w:val="0"/>
+              </w:rPr>
+              <w:t xml:space="preserve">| React, Vue.js, Angular, Next.js, Nuxt.js, Vite, Webpack, Babel, Rollup, Parcel, Preact, Svelte, SolidJS, JSX, TSX, Tailwind CSS, Bootstrap, Material UI, Ant Design, Chakra UI, Styled Components, Emotion, CSS Modules, HTML5, CSS3, Sass, Less, Responsive Design, Cross-Browser Compatibility, SVG, Canvas, WebGL, D3.js, Chart.js, Three.js, GSAP, Framer Motion, JavaScript, TypeScript, Node.js, Express.js, NestJS, Koa, Fastify, Python, Django, Flask, Java, Spring Boot, Kotlin, PHP, Laravel, Symfony, Ruby, Rails, Go, Gin, GraphQL, REST API, WebSockets, Socket.io, gRPC, Apollo Server, Prisma, TypeORM, Sequelize, Mongoose, MongoDB, PostgreSQL, MySQL, MariaDB, SQLite, Redis, Firebase, AWS Lambda, Serverless Framework, Git, GitHub, GitLab, Bitbucket, GitFlow, CI/CD, Jenkins, GitHub Actions, GitLab CI, Docker, Docker Compose, Kubernetes, Helm, Terraform, Ansible, Nginx, Apache, PM2, Bash, Zsh, Shell Scripting, Linux Ubuntu, Linux Debian, Linux CentOS, AWS, GCP, Azure, Firebase Hosting, Netlify, Vercel, Heroku, Cloudflare, Unit Testing, Integration Testing, End-to-End Testing, Jest, Mocha, Chai, Jasmine, Karma, Enzyme, Testing Library, Cypress, Playwright, ESLint, Prettier, SonarQube, Lerna, Turborepo, Yarn, NPM, PNPM, Storybook, React Testing Library, Cypress Testing, Firebase Realtime Database, Firebase Firestore, Firebase Authentication, Firebase Cloud Messaging, Firebase Crashlytics, Firebase Analytics, Webpack Dev Server, Vite Dev Server, Hot Module Replacement, Chrome DevTools, Lighthouse, Postman, Insomnia, RESTful APIs, GraphQL APIs, Apollo Client, SWR, React Query, Axios, Fetch API, Web Workers, Service Workers, PWA, IndexedDB, LocalStorage, SessionStorage, OAuth, JWT, OpenID, Passport.js, Bcrypt, Helmet, CORS, Rate Limiting, Compression, Logging, Winston, Morgan, Sentry, Rollbar, Redis Cache, Memcached, ElasticSearch, Kibana, Logstash, Prometheus, Grafana, NPM Scripts, Shell Scripts, Cron Jobs, CI Pipelines, Docker Swarm, Kubernetes Helm Charts, Microservices, Monorepo, MVC, MVVM, Clean Architecture, Repository Pattern, Dependency Injection, SOLID Principles, Design Patterns, Async/Await, Promises, Event Loop, Functional Programming, Object-Oriented Programming, Reactive Programming, RxJS, Observables, Coroutines, Streams, JSON, XML, YAML, TOML, Markdown, SQL, NoSQL, MongoDB Atlas, PostgreSQL PostGIS, Redis Streams, RabbitMQ, Kafka, WebSockets, HTTPS, TLS, OAuth2, SAML, Caching, CDN, CloudFront, S3, Lambda@Edge, Cloud Functions, Netlify Functions, Vercel Serverless, Server-Side Rendering, Client-Side Rendering, Static Site Generation, Incremental Static Regeneration, Code Splitting, Lazy Loading, Tree Shaking, Bundle Optimization, Performance Optimization, SEO, Accessibility, WAI-ARIA, Internationalization, Localization, i18n, l10n, Agile, Scrum, Kanban, Jira, Confluence, Trello, Figma, Zeplin, UX/UI, Storyboarding, Prototyping, Wireframing</w:t>
+            </w:r>
+            <w:r>
+              <w:rPr>
+                <w:rtl w:val="0"/>
+              </w:rPr>
+            </w:r>
+          </w:p>
+        </w:tc>
+      </w:tr>
+      <w:tr>
+        <w:trPr>
+          <w:cantSplit w:val="0"/>
+          <w:trHeight w:val="7710" w:hRule="atLeast"/>
+          <w:tblHeader w:val="0"/>
+        </w:trPr>
+        <w:tc>
+          <w:tcPr>
+            <w:tcBorders>
+              <w:top w:color="000000" w:space="0" w:sz="0" w:val="nil"/>
+              <w:left w:color="000000" w:space="0" w:sz="0" w:val="nil"/>
+              <w:bottom w:color="000000" w:space="0" w:sz="0" w:val="nil"/>
+              <w:right w:color="000000" w:space="0" w:sz="0" w:val="nil"/>
+            </w:tcBorders>
+            <w:shd w:fill="auto" w:val="clear"/>
+            <w:tcMar>
+              <w:top w:w="72.0" w:type="dxa"/>
+              <w:left w:w="72.0" w:type="dxa"/>
+              <w:bottom w:w="72.0" w:type="dxa"/>
+              <w:right w:w="72.0" w:type="dxa"/>
+            </w:tcMar>
+            <w:vAlign w:val="top"/>
+          </w:tcPr>
+          <w:p>
+            <w:pPr>
+              <w:widowControl w:val="0"/>
+              <w:spacing w:before="0" w:line="240" w:lineRule="auto"/>
+              <w:rPr/>
+            </w:pPr>
+            <w:r>
+              <w:rPr>
+                <w:rFonts w:ascii="Arial Unicode MS" w:cs="Arial Unicode MS" w:eastAsia="Arial Unicode MS" w:hAnsi="Arial Unicode MS"/>
+                <w:b w:val="1"/>
+                <w:bCs w:val="1"/>
+                <w:sz w:val="28"/>
+                <w:szCs w:val="28"/>
+                <w:rtl w:val="0"/>
+              </w:rPr>
+              <w:t xml:space="preserve">ㅡ</w:t>
+            </w:r>
+            <w:r>
+              <w:rPr>
+                <w:rtl w:val="0"/>
+              </w:rPr>
+            </w:r>
+          </w:p>
+          <w:p>
+            <w:pPr>
+              <w:pStyle w:val="Heading1"/>
+              <w:spacing w:before="0" w:line="240" w:lineRule="auto"/>
+              <w:rPr/>
+            </w:pPr>
+            <w:bookmarkStart w:colFirst="0" w:colLast="0" w:name="_9dlb5py1h4rs" w:id="6"/>
+            <w:bookmarkEnd w:id="6"/>
+            <w:r>
+              <w:rPr>
+                <w:rtl w:val="0"/>
+              </w:rPr>
+              <w:t xml:space="preserve">Vzdělání:</w:t>
+            </w:r>
+          </w:p>
+          <w:p>
+            <w:pPr>
+              <w:spacing w:before="0" w:line="240" w:lineRule="auto"/>
+              <w:rPr/>
+            </w:pPr>
+            <w:r>
+              <w:rPr>
+                <w:rtl w:val="0"/>
+              </w:rPr>
+              <w:t xml:space="preserve">Charkovská národní univerzita radioelektroniky (KhNURE)</w:t>
+            </w:r>
+          </w:p>
+          <w:p>
+            <w:pPr>
+              <w:spacing w:before="0" w:line="240" w:lineRule="auto"/>
+              <w:rPr/>
+            </w:pPr>
+            <w:r>
+              <w:rPr>
+                <w:rtl w:val="0"/>
+              </w:rPr>
+              <w:t xml:space="preserve">Bakalářský titul v oboru radioinženýrství</w:t>
+            </w:r>
+          </w:p>
+          <w:p>
+            <w:pPr>
+              <w:spacing w:before="0" w:line="240" w:lineRule="auto"/>
+              <w:rPr/>
+            </w:pPr>
+            <w:r>
+              <w:rPr>
+                <w:rtl w:val="0"/>
+              </w:rPr>
+              <w:t xml:space="preserve">2004 – 2009</w:t>
+            </w:r>
+          </w:p>
+          <w:p>
+            <w:pPr>
+              <w:spacing w:before="0" w:line="240" w:lineRule="auto"/>
+              <w:rPr/>
+            </w:pPr>
+            <w:r>
+              <w:rPr>
+                <w:rtl w:val="0"/>
+              </w:rPr>
+              <w:t xml:space="preserve">Charkov, Ukrajina</w:t>
+            </w:r>
+          </w:p>
+          <w:p>
+            <w:pPr>
+              <w:spacing w:before="0" w:line="240" w:lineRule="auto"/>
+              <w:rPr/>
+            </w:pPr>
+            <w:r>
+              <w:rPr>
+                <w:rtl w:val="0"/>
+              </w:rPr>
+            </w:r>
+          </w:p>
+          <w:p>
+            <w:pPr>
+              <w:widowControl w:val="0"/>
+              <w:spacing w:before="0" w:line="240" w:lineRule="auto"/>
+              <w:rPr>
+                <w:b w:val="1"/>
+                <w:bCs w:val="1"/>
+                <w:sz w:val="28"/>
+                <w:szCs w:val="28"/>
+              </w:rPr>
+            </w:pPr>
+            <w:r>
+              <w:rPr>
+                <w:rFonts w:ascii="Arial Unicode MS" w:cs="Arial Unicode MS" w:eastAsia="Arial Unicode MS" w:hAnsi="Arial Unicode MS"/>
+                <w:b w:val="1"/>
+                <w:bCs w:val="1"/>
+                <w:sz w:val="28"/>
+                <w:szCs w:val="28"/>
+                <w:rtl w:val="0"/>
+              </w:rPr>
+              <w:t xml:space="preserve">ㅡ</w:t>
+            </w:r>
+          </w:p>
+          <w:p>
+            <w:pPr>
+              <w:pStyle w:val="Heading1"/>
+              <w:spacing w:before="0" w:line="240" w:lineRule="auto"/>
+              <w:rPr/>
+            </w:pPr>
+            <w:bookmarkStart w:colFirst="0" w:colLast="0" w:name="_x47o0hoetp2x" w:id="7"/>
+            <w:bookmarkEnd w:id="7"/>
+            <w:r>
+              <w:rPr>
+                <w:rtl w:val="0"/>
+              </w:rPr>
+              <w:t xml:space="preserve">Lokalita:</w:t>
+            </w:r>
+          </w:p>
+          <w:p>
+            <w:pPr>
+              <w:spacing w:before="0" w:line="240" w:lineRule="auto"/>
+              <w:rPr/>
+            </w:pPr>
+            <w:r>
+              <w:rPr>
+                <w:rtl w:val="0"/>
+              </w:rPr>
+              <w:t xml:space="preserve">Brno, Česká republika | </w:t>
+            </w:r>
+          </w:p>
+          <w:p>
+            <w:pPr>
+              <w:spacing w:before="0" w:line="240" w:lineRule="auto"/>
+              <w:rPr/>
+            </w:pPr>
+            <w:r>
+              <w:rPr>
+                <w:rtl w:val="0"/>
+              </w:rPr>
+              <w:t xml:space="preserve">Možnost relokace v rámci</w:t>
+            </w:r>
+          </w:p>
+          <w:p>
+            <w:pPr>
+              <w:spacing w:before="0" w:line="240" w:lineRule="auto"/>
+              <w:rPr/>
+            </w:pPr>
+            <w:r>
+              <w:rPr>
+                <w:rtl w:val="0"/>
+              </w:rPr>
+              <w:t xml:space="preserve">České republiky |</w:t>
+            </w:r>
+          </w:p>
+          <w:p>
+            <w:pPr>
+              <w:spacing w:before="0" w:line="240" w:lineRule="auto"/>
+              <w:rPr/>
+            </w:pPr>
+            <w:r>
+              <w:rPr>
+                <w:rtl w:val="0"/>
+              </w:rPr>
+              <w:t xml:space="preserve">Remote</w:t>
+            </w:r>
+          </w:p>
+          <w:p>
+            <w:pPr>
+              <w:widowControl w:val="0"/>
+              <w:spacing w:before="0" w:line="240" w:lineRule="auto"/>
+              <w:rPr>
+                <w:b w:val="1"/>
+                <w:bCs w:val="1"/>
+                <w:sz w:val="28"/>
+                <w:szCs w:val="28"/>
+              </w:rPr>
+            </w:pPr>
+            <w:r>
+              <w:rPr>
+                <w:rtl w:val="0"/>
+              </w:rPr>
+            </w:r>
+          </w:p>
+          <w:p>
+            <w:pPr>
+              <w:widowControl w:val="0"/>
+              <w:spacing w:before="0" w:line="240" w:lineRule="auto"/>
+              <w:rPr>
+                <w:b w:val="1"/>
+                <w:bCs w:val="1"/>
+                <w:sz w:val="20"/>
+                <w:szCs w:val="20"/>
+              </w:rPr>
+            </w:pPr>
+            <w:r>
+              <w:rPr>
+                <w:rFonts w:ascii="Arial Unicode MS" w:cs="Arial Unicode MS" w:eastAsia="Arial Unicode MS" w:hAnsi="Arial Unicode MS"/>
+                <w:b w:val="1"/>
+                <w:bCs w:val="1"/>
+                <w:sz w:val="28"/>
+                <w:szCs w:val="28"/>
+                <w:rtl w:val="0"/>
+              </w:rPr>
+              <w:t xml:space="preserve">ㅡ</w:t>
+            </w:r>
+            <w:r>
+              <w:rPr>
+                <w:rtl w:val="0"/>
+              </w:rPr>
+            </w:r>
+          </w:p>
+          <w:p>
+            <w:pPr>
+              <w:pStyle w:val="Heading1"/>
+              <w:spacing w:before="0" w:line="240" w:lineRule="auto"/>
+              <w:rPr/>
+            </w:pPr>
+            <w:bookmarkStart w:colFirst="0" w:colLast="0" w:name="_ayyy3llf0ql9" w:id="8"/>
+            <w:bookmarkEnd w:id="8"/>
+            <w:r>
+              <w:rPr>
+                <w:rtl w:val="0"/>
+              </w:rPr>
+              <w:t xml:space="preserve">Jazyky:</w:t>
+            </w:r>
+          </w:p>
+          <w:p>
+            <w:pPr>
+              <w:spacing w:before="0" w:line="240" w:lineRule="auto"/>
+              <w:rPr/>
+            </w:pPr>
+            <w:r>
+              <w:rPr>
+                <w:rtl w:val="0"/>
+              </w:rPr>
+              <w:t xml:space="preserve">Angličtina — B1</w:t>
+            </w:r>
+          </w:p>
+          <w:p>
+            <w:pPr>
+              <w:spacing w:before="0" w:line="240" w:lineRule="auto"/>
+              <w:rPr/>
+            </w:pPr>
+            <w:r>
+              <w:rPr>
+                <w:rtl w:val="0"/>
+              </w:rPr>
+              <w:t xml:space="preserve">Čeština — B2</w:t>
+            </w:r>
+          </w:p>
+          <w:p>
+            <w:pPr>
+              <w:spacing w:before="0" w:line="240" w:lineRule="auto"/>
+              <w:rPr/>
+            </w:pPr>
+            <w:r>
+              <w:rPr>
+                <w:rtl w:val="0"/>
+              </w:rPr>
+              <w:t xml:space="preserve">Ruština — rodilý mluvčí</w:t>
+            </w:r>
+          </w:p>
+          <w:p>
+            <w:pPr>
+              <w:spacing w:before="0" w:line="240" w:lineRule="auto"/>
+              <w:rPr/>
+            </w:pPr>
+            <w:r>
+              <w:rPr>
+                <w:rtl w:val="0"/>
+              </w:rPr>
+              <w:t xml:space="preserve">Ukrajinština — rodilý mluvčí</w:t>
+            </w:r>
+          </w:p>
+          <w:p>
+            <w:pPr>
+              <w:spacing w:before="0" w:line="240" w:lineRule="auto"/>
+              <w:rPr/>
+            </w:pPr>
+            <w:r>
+              <w:rPr>
+                <w:rtl w:val="0"/>
+              </w:rPr>
+            </w:r>
+          </w:p>
+          <w:p>
+            <w:pPr>
+              <w:spacing w:before="0" w:line="240" w:lineRule="auto"/>
+              <w:rPr/>
+            </w:pPr>
+            <w:r>
+              <w:rPr>
+                <w:rtl w:val="0"/>
+              </w:rPr>
+            </w:r>
+          </w:p>
+        </w:tc>
+        <w:tc>
+          <w:tcPr>
+            <w:tcBorders>
+              <w:top w:color="000000" w:space="0" w:sz="0" w:val="nil"/>
+              <w:left w:color="000000" w:space="0" w:sz="0" w:val="nil"/>
+              <w:bottom w:color="000000" w:space="0" w:sz="0" w:val="nil"/>
+              <w:right w:color="000000" w:space="0" w:sz="0" w:val="nil"/>
+            </w:tcBorders>
+            <w:shd w:fill="auto" w:val="clear"/>
+            <w:tcMar>
+              <w:top w:w="100.0" w:type="dxa"/>
+              <w:left w:w="100.0" w:type="dxa"/>
+              <w:bottom w:w="100.0" w:type="dxa"/>
+              <w:right w:w="100.0" w:type="dxa"/>
+            </w:tcMar>
+            <w:vAlign w:val="top"/>
+          </w:tcPr>
+          <w:p>
+            <w:pPr>
+              <w:pageBreakBefore w:val="0"/>
+              <w:widowControl w:val="0"/>
+              <w:pBdr>
+                <w:top w:space="0" w:sz="0" w:val="nil"/>
+                <w:left w:space="0" w:sz="0" w:val="nil"/>
+                <w:bottom w:space="0" w:sz="0" w:val="nil"/>
+                <w:right w:space="0" w:sz="0" w:val="nil"/>
+                <w:between w:space="0" w:sz="0" w:val="nil"/>
+              </w:pBdr>
+              <w:shd w:fill="auto" w:val="clear"/>
+              <w:spacing w:before="0" w:lineRule="auto"/>
+              <w:rPr>
+                <w:rFonts w:ascii="Lato" w:cs="Lato" w:eastAsia="Lato" w:hAnsi="Lato"/>
+                <w:sz w:val="20"/>
+                <w:szCs w:val="20"/>
+              </w:rPr>
+            </w:pPr>
+            <w:r>
+              <w:rPr>
+                <w:rFonts w:ascii="Lato" w:cs="Lato" w:eastAsia="Lato" w:hAnsi="Lato"/>
+                <w:sz w:val="20"/>
+                <w:szCs w:val="20"/>
+              </w:rPr>
+              <w:drawing>
+                <wp:inline distB="114300" distT="114300" distL="114300" distR="114300">
+                  <wp:extent cx="3981450" cy="25400"/>
+                  <wp:effectExtent b="0" l="0" r="0" t="0"/>
+                  <wp:docPr descr="horizontal line" id="1" name="image1.png"/>
                   <a:graphic>
                     <a:graphicData uri="http://schemas.openxmlformats.org/drawingml/2006/picture">
                       <pic:pic>
@@ -541,514 +1024,13 @@
               <w:keepNext w:val="0"/>
               <w:keepLines w:val="0"/>
               <w:widowControl w:val="0"/>
-              <w:rPr/>
-            </w:pPr>
-            <w:bookmarkStart w:colFirst="0" w:colLast="0" w:name="_wr714354mg9g" w:id="4"/>
-            <w:bookmarkEnd w:id="4"/>
-            <w:r>
-              <w:rPr>
-                <w:rtl w:val="0"/>
-              </w:rPr>
-              <w:t xml:space="preserve">Skills : </w:t>
-            </w:r>
-          </w:p>
-          <w:p>
-            <w:pPr>
-              <w:pStyle w:val="Heading1"/>
-              <w:keepNext w:val="0"/>
-              <w:keepLines w:val="0"/>
-              <w:widowControl w:val="0"/>
-              <w:rPr>
-                <w:color w:val="ffffff"/>
-                <w:sz w:val="2"/>
-                <w:szCs w:val="2"/>
-              </w:rPr>
-            </w:pPr>
-            <w:bookmarkStart w:colFirst="0" w:colLast="0" w:name="_6e75g6c9ydf6" w:id="5"/>
-            <w:bookmarkEnd w:id="5"/>
-            <w:r>
-              <w:rPr>
-                <w:sz w:val="20"/>
-                <w:szCs w:val="20"/>
-                <w:rtl w:val="0"/>
-              </w:rPr>
-              <w:t xml:space="preserve">React, Vue.js, Vite, Babel, JSX, TSX, Components, CSS Modules, Sass, Responsive Design, Cross-Browser Compatibility, SVG, Canvas, JavaScript, TypeScript, Node.js, Express.js, Python, Java, REST API, WebSockets, Prisma, Mongoose, MongoDB, PostgreSQL, MySQL, SQLite, Nginx, Bash, Shell , Ubuntu, Linux, Cloudflare</w:t>
-            </w:r>
-            <w:r>
-              <w:rPr>
-                <w:color w:val="ffffff"/>
-                <w:sz w:val="20"/>
-                <w:szCs w:val="20"/>
-                <w:rtl w:val="0"/>
-              </w:rPr>
-              <w:t xml:space="preserve">,</w:t>
-            </w:r>
-            <w:r>
-              <w:rPr>
-                <w:color w:val="ffffff"/>
-                <w:sz w:val="2"/>
-                <w:szCs w:val="2"/>
-                <w:rtl w:val="0"/>
-              </w:rPr>
-              <w:t xml:space="preserve">| React, Vue.js, Angular, Next.js, Nuxt.js, Vite, Webpack, Babel, Rollup, Parcel, Preact, Svelte, SolidJS, JSX, TSX, Tailwind CSS, Bootstrap, Material UI, Ant Design, Chakra UI, Styled Components, Emotion, CSS Modules, HTML5, CSS3, Sass, Less, Responsive Design, Cross-Browser Compatibility, SVG, Canvas, WebGL, D3.js, Chart.js, Three.js, GSAP, Framer Motion, JavaScript, TypeScript, Node.js, Express.js, NestJS, Koa, Fastify, Python, Django, Flask, Java, Spring Boot, Kotlin, PHP, Laravel, Symfony, Ruby, Rails, Go, Gin, GraphQL, REST API, WebSockets, Socket.io, gRPC, Apollo Server, Prisma, TypeORM, Sequelize, Mongoose, MongoDB, PostgreSQL, MySQL, MariaDB, SQLite, Redis, Firebase, AWS Lambda, Serverless Framework, Git, GitHub, GitLab, Bitbucket, GitFlow, CI/CD, Jenkins, GitHub Actions, GitLab CI, Docker, Docker Compose, Kubernetes, Helm, Terraform, Ansible, Nginx, Apache, PM2, Bash, Zsh, Shell Scripting, Linux Ubuntu, Linux Debian, Linux CentOS, AWS, GCP, Azure, Firebase Hosting, Netlify, Vercel, Heroku, Cloudflare, Unit Testing, Integration Testing, End-to-End Testing, Jest, Mocha, Chai, Jasmine, Karma, Enzyme, Testing Library, Cypress, Playwright, ESLint, Prettier, SonarQube, Lerna, Turborepo, Yarn, NPM, PNPM, Storybook, React Testing Library, Cypress Testing, Firebase Realtime Database, Firebase Firestore, Firebase Authentication, Firebase Cloud Messaging, Firebase Crashlytics, Firebase Analytics, Webpack Dev Server, Vite Dev Server, Hot Module Replacement, Chrome DevTools, Lighthouse, Postman, Insomnia, RESTful APIs, GraphQL APIs, Apollo Client, SWR, React Query, Axios, Fetch API, Web Workers, Service Workers, PWA, IndexedDB, LocalStorage, SessionStorage, OAuth, JWT, OpenID, Passport.js, Bcrypt, Helmet, CORS, Rate Limiting, Compression, Logging, Winston, Morgan, Sentry, Rollbar, Redis Cache, Memcached, ElasticSearch, Kibana, Logstash, Prometheus, Grafana, NPM Scripts, Shell Scripts, Cron Jobs, CI Pipelines, Docker Swarm, Kubernetes Helm Charts, Microservices, Monorepo, MVC, MVVM, Clean Architecture, Repository Pattern, Dependency Injection, SOLID Principles, Design Patterns, Async/Await, Promises, Event Loop, Functional Programming, Object-Oriented Programming, Reactive Programming, RxJS, Observables, Coroutines, Streams, JSON, XML, YAML, TOML, Markdown, SQL, NoSQL, MongoDB Atlas, PostgreSQL PostGIS, Redis Streams, RabbitMQ, Kafka, WebSockets, HTTPS, TLS, OAuth2, SAML, Caching, CDN, CloudFront, S3, Lambda@Edge, Cloud Functions, Netlify Functions, Vercel Serverless, Server-Side Rendering, Client-Side Rendering, Static Site Generation, Incremental Static Regeneration, Code Splitting, Lazy Loading, Tree Shaking, Bundle Optimization, Performance Optimization, SEO, Accessibility, WAI-ARIA, Internationalization, Localization, i18n, l10n, Agile, Scrum, Kanban, Jira, Confluence, Trello, Figma, Zeplin, UX/UI, Storyboarding, Prototyping, Wireframing</w:t>
-            </w:r>
-            <w:r>
-              <w:rPr>
-                <w:rtl w:val="0"/>
-              </w:rPr>
-            </w:r>
-          </w:p>
-        </w:tc>
-      </w:tr>
-      <w:tr>
-        <w:trPr>
-          <w:cantSplit w:val="0"/>
-          <w:trHeight w:val="7710" w:hRule="atLeast"/>
-          <w:tblHeader w:val="0"/>
-        </w:trPr>
-        <w:tc>
-          <w:tcPr>
-            <w:tcBorders>
-              <w:top w:color="000000" w:space="0" w:sz="0" w:val="nil"/>
-              <w:left w:color="000000" w:space="0" w:sz="0" w:val="nil"/>
-              <w:bottom w:color="000000" w:space="0" w:sz="0" w:val="nil"/>
-              <w:right w:color="000000" w:space="0" w:sz="0" w:val="nil"/>
-            </w:tcBorders>
-            <w:shd w:fill="auto" w:val="clear"/>
-            <w:tcMar>
-              <w:top w:w="72.0" w:type="dxa"/>
-              <w:left w:w="72.0" w:type="dxa"/>
-              <w:bottom w:w="72.0" w:type="dxa"/>
-              <w:right w:w="72.0" w:type="dxa"/>
-            </w:tcMar>
-            <w:vAlign w:val="top"/>
-          </w:tcPr>
-          <w:p>
-            <w:pPr>
-              <w:widowControl w:val="0"/>
-              <w:spacing w:before="0" w:line="240" w:lineRule="auto"/>
-              <w:rPr/>
-            </w:pPr>
-            <w:r>
-              <w:rPr>
-                <w:rFonts w:ascii="Arial Unicode MS" w:cs="Arial Unicode MS" w:eastAsia="Arial Unicode MS" w:hAnsi="Arial Unicode MS"/>
-                <w:b w:val="1"/>
-                <w:bCs w:val="1"/>
-                <w:sz w:val="28"/>
-                <w:szCs w:val="28"/>
-                <w:rtl w:val="0"/>
-              </w:rPr>
-              <w:t xml:space="preserve">ㅡ</w:t>
-            </w:r>
-            <w:r>
-              <w:rPr>
-                <w:rtl w:val="0"/>
-              </w:rPr>
-            </w:r>
-          </w:p>
-          <w:p>
-            <w:pPr>
-              <w:spacing w:before="0" w:line="240" w:lineRule="auto"/>
-              <w:rPr>
-                <w:b w:val="1"/>
-                <w:bCs w:val="1"/>
+              <w:rPr>
                 <w:sz w:val="24"/>
                 <w:szCs w:val="24"/>
               </w:rPr>
             </w:pPr>
-            <w:r>
-              <w:rPr>
-                <w:b w:val="1"/>
-                <w:bCs w:val="1"/>
-                <w:sz w:val="24"/>
-                <w:szCs w:val="24"/>
-                <w:rtl w:val="0"/>
-              </w:rPr>
-              <w:t xml:space="preserve">Vzdělání:</w:t>
-            </w:r>
-          </w:p>
-          <w:p>
-            <w:pPr>
-              <w:spacing w:before="0" w:line="240" w:lineRule="auto"/>
-              <w:rPr/>
-            </w:pPr>
-            <w:r>
-              <w:rPr>
-                <w:rtl w:val="0"/>
-              </w:rPr>
-              <w:t xml:space="preserve">Charkovská národní univerzita radioelektroniky (KhNURE)</w:t>
-            </w:r>
-          </w:p>
-          <w:p>
-            <w:pPr>
-              <w:spacing w:before="0" w:line="240" w:lineRule="auto"/>
-              <w:rPr/>
-            </w:pPr>
-            <w:r>
-              <w:rPr>
-                <w:rtl w:val="0"/>
-              </w:rPr>
-              <w:t xml:space="preserve">Bakalářský titul v oboru radioinženýrství</w:t>
-            </w:r>
-          </w:p>
-          <w:p>
-            <w:pPr>
-              <w:spacing w:before="0" w:line="240" w:lineRule="auto"/>
-              <w:rPr/>
-            </w:pPr>
-            <w:r>
-              <w:rPr>
-                <w:rtl w:val="0"/>
-              </w:rPr>
-              <w:t xml:space="preserve">2004 – 2009</w:t>
-            </w:r>
-          </w:p>
-          <w:p>
-            <w:pPr>
-              <w:spacing w:before="0" w:line="240" w:lineRule="auto"/>
-              <w:rPr/>
-            </w:pPr>
-            <w:r>
-              <w:rPr>
-                <w:rtl w:val="0"/>
-              </w:rPr>
-              <w:t xml:space="preserve">Charkov, Ukrajina</w:t>
-            </w:r>
-          </w:p>
-          <w:p>
-            <w:pPr>
-              <w:spacing w:before="0" w:line="240" w:lineRule="auto"/>
-              <w:rPr/>
-            </w:pPr>
-            <w:r>
-              <w:rPr>
-                <w:rtl w:val="0"/>
-              </w:rPr>
-            </w:r>
-          </w:p>
-          <w:p>
-            <w:pPr>
-              <w:widowControl w:val="0"/>
-              <w:spacing w:before="0" w:line="240" w:lineRule="auto"/>
-              <w:rPr>
-                <w:b w:val="1"/>
-                <w:bCs w:val="1"/>
-                <w:sz w:val="28"/>
-                <w:szCs w:val="28"/>
-              </w:rPr>
-            </w:pPr>
-            <w:r>
-              <w:rPr>
-                <w:rFonts w:ascii="Arial Unicode MS" w:cs="Arial Unicode MS" w:eastAsia="Arial Unicode MS" w:hAnsi="Arial Unicode MS"/>
-                <w:b w:val="1"/>
-                <w:bCs w:val="1"/>
-                <w:sz w:val="28"/>
-                <w:szCs w:val="28"/>
-                <w:rtl w:val="0"/>
-              </w:rPr>
-              <w:t xml:space="preserve">ㅡ</w:t>
-            </w:r>
-          </w:p>
-          <w:p>
-            <w:pPr>
-              <w:spacing w:before="0" w:line="240" w:lineRule="auto"/>
-              <w:rPr>
-                <w:b w:val="1"/>
-                <w:bCs w:val="1"/>
-                <w:sz w:val="24"/>
-                <w:szCs w:val="24"/>
-              </w:rPr>
-            </w:pPr>
-            <w:r>
-              <w:rPr>
-                <w:b w:val="1"/>
-                <w:bCs w:val="1"/>
-                <w:sz w:val="24"/>
-                <w:szCs w:val="24"/>
-                <w:rtl w:val="0"/>
-              </w:rPr>
-              <w:t xml:space="preserve">Lokalita:</w:t>
-            </w:r>
-          </w:p>
-          <w:p>
-            <w:pPr>
-              <w:spacing w:before="0" w:line="240" w:lineRule="auto"/>
-              <w:rPr/>
-            </w:pPr>
-            <w:r>
-              <w:rPr>
-                <w:rtl w:val="0"/>
-              </w:rPr>
-              <w:t xml:space="preserve">Brno, Česká republika | </w:t>
-            </w:r>
-          </w:p>
-          <w:p>
-            <w:pPr>
-              <w:spacing w:before="0" w:line="240" w:lineRule="auto"/>
-              <w:rPr/>
-            </w:pPr>
-            <w:r>
-              <w:rPr>
-                <w:rtl w:val="0"/>
-              </w:rPr>
-              <w:t xml:space="preserve">Možnost relokace v rámci</w:t>
-            </w:r>
-          </w:p>
-          <w:p>
-            <w:pPr>
-              <w:spacing w:before="0" w:line="240" w:lineRule="auto"/>
-              <w:rPr/>
-            </w:pPr>
-            <w:r>
-              <w:rPr>
-                <w:rtl w:val="0"/>
-              </w:rPr>
-              <w:t xml:space="preserve">České republiky |</w:t>
-            </w:r>
-          </w:p>
-          <w:p>
-            <w:pPr>
-              <w:spacing w:before="0" w:line="240" w:lineRule="auto"/>
-              <w:rPr/>
-            </w:pPr>
-            <w:r>
-              <w:rPr>
-                <w:rtl w:val="0"/>
-              </w:rPr>
-              <w:t xml:space="preserve">Remote</w:t>
-            </w:r>
-          </w:p>
-          <w:p>
-            <w:pPr>
-              <w:widowControl w:val="0"/>
-              <w:spacing w:before="0" w:line="240" w:lineRule="auto"/>
-              <w:rPr>
-                <w:b w:val="1"/>
-                <w:bCs w:val="1"/>
-                <w:sz w:val="28"/>
-                <w:szCs w:val="28"/>
-              </w:rPr>
-            </w:pPr>
-            <w:r>
-              <w:rPr>
-                <w:rtl w:val="0"/>
-              </w:rPr>
-            </w:r>
-          </w:p>
-          <w:p>
-            <w:pPr>
-              <w:widowControl w:val="0"/>
-              <w:spacing w:before="0" w:line="240" w:lineRule="auto"/>
-              <w:rPr>
-                <w:b w:val="1"/>
-                <w:bCs w:val="1"/>
-                <w:sz w:val="20"/>
-                <w:szCs w:val="20"/>
-              </w:rPr>
-            </w:pPr>
-            <w:r>
-              <w:rPr>
-                <w:rFonts w:ascii="Arial Unicode MS" w:cs="Arial Unicode MS" w:eastAsia="Arial Unicode MS" w:hAnsi="Arial Unicode MS"/>
-                <w:b w:val="1"/>
-                <w:bCs w:val="1"/>
-                <w:sz w:val="28"/>
-                <w:szCs w:val="28"/>
-                <w:rtl w:val="0"/>
-              </w:rPr>
-              <w:t xml:space="preserve">ㅡ</w:t>
-            </w:r>
-            <w:r>
-              <w:rPr>
-                <w:rtl w:val="0"/>
-              </w:rPr>
-            </w:r>
-          </w:p>
-          <w:p>
-            <w:pPr>
-              <w:spacing w:before="0" w:line="240" w:lineRule="auto"/>
-              <w:rPr>
-                <w:b w:val="1"/>
-                <w:bCs w:val="1"/>
-                <w:sz w:val="24"/>
-                <w:szCs w:val="24"/>
-              </w:rPr>
-            </w:pPr>
-            <w:r>
-              <w:rPr>
-                <w:b w:val="1"/>
-                <w:bCs w:val="1"/>
-                <w:sz w:val="24"/>
-                <w:szCs w:val="24"/>
-                <w:rtl w:val="0"/>
-              </w:rPr>
-              <w:t xml:space="preserve">Jazyky:</w:t>
-            </w:r>
-          </w:p>
-          <w:p>
-            <w:pPr>
-              <w:spacing w:before="0" w:line="240" w:lineRule="auto"/>
-              <w:rPr/>
-            </w:pPr>
-            <w:r>
-              <w:rPr>
-                <w:rtl w:val="0"/>
-              </w:rPr>
-              <w:t xml:space="preserve">Angličtina — B1</w:t>
-            </w:r>
-          </w:p>
-          <w:p>
-            <w:pPr>
-              <w:spacing w:before="0" w:line="240" w:lineRule="auto"/>
-              <w:rPr/>
-            </w:pPr>
-            <w:r>
-              <w:rPr>
-                <w:rtl w:val="0"/>
-              </w:rPr>
-              <w:t xml:space="preserve">Čeština — B2</w:t>
-            </w:r>
-          </w:p>
-          <w:p>
-            <w:pPr>
-              <w:spacing w:before="0" w:line="240" w:lineRule="auto"/>
-              <w:rPr/>
-            </w:pPr>
-            <w:r>
-              <w:rPr>
-                <w:rtl w:val="0"/>
-              </w:rPr>
-              <w:t xml:space="preserve">Ruština — rodilý mluvčí</w:t>
-            </w:r>
-          </w:p>
-          <w:p>
-            <w:pPr>
-              <w:spacing w:before="0" w:line="240" w:lineRule="auto"/>
-              <w:rPr/>
-            </w:pPr>
-            <w:r>
-              <w:rPr>
-                <w:rtl w:val="0"/>
-              </w:rPr>
-              <w:t xml:space="preserve">Ukrajinština — rodilý mluvčí</w:t>
-            </w:r>
-          </w:p>
-          <w:p>
-            <w:pPr>
-              <w:spacing w:before="0" w:line="240" w:lineRule="auto"/>
-              <w:rPr/>
-            </w:pPr>
-            <w:r>
-              <w:rPr>
-                <w:rtl w:val="0"/>
-              </w:rPr>
-            </w:r>
-          </w:p>
-          <w:p>
-            <w:pPr>
-              <w:spacing w:before="0" w:line="240" w:lineRule="auto"/>
-              <w:rPr/>
-            </w:pPr>
-            <w:r>
-              <w:rPr>
-                <w:rtl w:val="0"/>
-              </w:rPr>
-            </w:r>
-          </w:p>
-        </w:tc>
-        <w:tc>
-          <w:tcPr>
-            <w:tcBorders>
-              <w:top w:color="000000" w:space="0" w:sz="0" w:val="nil"/>
-              <w:left w:color="000000" w:space="0" w:sz="0" w:val="nil"/>
-              <w:bottom w:color="000000" w:space="0" w:sz="0" w:val="nil"/>
-              <w:right w:color="000000" w:space="0" w:sz="0" w:val="nil"/>
-            </w:tcBorders>
-            <w:shd w:fill="auto" w:val="clear"/>
-            <w:tcMar>
-              <w:top w:w="100.0" w:type="dxa"/>
-              <w:left w:w="100.0" w:type="dxa"/>
-              <w:bottom w:w="100.0" w:type="dxa"/>
-              <w:right w:w="100.0" w:type="dxa"/>
-            </w:tcMar>
-            <w:vAlign w:val="top"/>
-          </w:tcPr>
-          <w:p>
-            <w:pPr>
-              <w:pageBreakBefore w:val="0"/>
-              <w:widowControl w:val="0"/>
-              <w:pBdr>
-                <w:top w:space="0" w:sz="0" w:val="nil"/>
-                <w:left w:space="0" w:sz="0" w:val="nil"/>
-                <w:bottom w:space="0" w:sz="0" w:val="nil"/>
-                <w:right w:space="0" w:sz="0" w:val="nil"/>
-                <w:between w:space="0" w:sz="0" w:val="nil"/>
-              </w:pBdr>
-              <w:shd w:fill="auto" w:val="clear"/>
-              <w:spacing w:before="0" w:lineRule="auto"/>
-              <w:rPr>
-                <w:rFonts w:ascii="Lato" w:cs="Lato" w:eastAsia="Lato" w:hAnsi="Lato"/>
-                <w:sz w:val="20"/>
-                <w:szCs w:val="20"/>
-              </w:rPr>
-            </w:pPr>
-            <w:r>
-              <w:rPr>
-                <w:rFonts w:ascii="Lato" w:cs="Lato" w:eastAsia="Lato" w:hAnsi="Lato"/>
-                <w:sz w:val="20"/>
-                <w:szCs w:val="20"/>
-              </w:rPr>
-              <w:drawing>
-                <wp:inline distB="114300" distT="114300" distL="114300" distR="114300">
-                  <wp:extent cx="3981450" cy="25400"/>
-                  <wp:effectExtent b="0" l="0" r="0" t="0"/>
-                  <wp:docPr descr="horizontal line" id="1" name="image2.png"/>
-                  <a:graphic>
-                    <a:graphicData uri="http://schemas.openxmlformats.org/drawingml/2006/picture">
-                      <pic:pic>
-                        <pic:nvPicPr>
-                          <pic:cNvPr descr="horizontal line" id="0" name="image2.png"/>
-                          <pic:cNvPicPr preferRelativeResize="0"/>
-                        </pic:nvPicPr>
-                        <pic:blipFill>
-                          <a:blip r:embed="rId12"/>
-                          <a:srcRect b="0" l="0" r="0" t="0"/>
-                          <a:stretch>
-                            <a:fillRect/>
-                          </a:stretch>
-                        </pic:blipFill>
-                        <pic:spPr>
-                          <a:xfrm>
-                            <a:off x="0" y="0"/>
-                            <a:ext cx="3981450" cy="25400"/>
-                          </a:xfrm>
-                          <a:prstGeom prst="rect"/>
-                          <a:ln/>
-                        </pic:spPr>
-                      </pic:pic>
-                    </a:graphicData>
-                  </a:graphic>
-                </wp:inline>
-              </w:drawing>
-            </w:r>
-            <w:r>
-              <w:rPr>
-                <w:rtl w:val="0"/>
-              </w:rPr>
-            </w:r>
-          </w:p>
-          <w:p>
-            <w:pPr>
-              <w:pStyle w:val="Heading1"/>
-              <w:keepNext w:val="0"/>
-              <w:keepLines w:val="0"/>
-              <w:widowControl w:val="0"/>
-              <w:rPr>
-                <w:sz w:val="24"/>
-                <w:szCs w:val="24"/>
-              </w:rPr>
-            </w:pPr>
-            <w:bookmarkStart w:colFirst="0" w:colLast="0" w:name="_czm83cenksjq" w:id="6"/>
-            <w:bookmarkEnd w:id="6"/>
+            <w:bookmarkStart w:colFirst="0" w:colLast="0" w:name="_czm83cenksjq" w:id="9"/>
+            <w:bookmarkEnd w:id="9"/>
             <w:r>
               <w:rPr>
                 <w:sz w:val="24"/>
@@ -1252,8 +1234,8 @@
           <w:szCs w:val="16"/>
         </w:rPr>
       </w:pPr>
-      <w:bookmarkStart w:colFirst="0" w:colLast="0" w:name="_1ozrry7nbnby" w:id="7"/>
-      <w:bookmarkEnd w:id="7"/>
+      <w:bookmarkStart w:colFirst="0" w:colLast="0" w:name="_1ozrry7nbnby" w:id="10"/>
+      <w:bookmarkEnd w:id="10"/>
       <w:r>
         <w:rPr>
           <w:sz w:val="16"/>

</xml_diff>